<commit_message>
removing mids and changing eval
</commit_message>
<xml_diff>
--- a/docs/Final_Paper_Midi_Lines.docx
+++ b/docs/Final_Paper_Midi_Lines.docx
@@ -1,16 +1,56 @@
 
 <file path=word/document.xml><?xml version="1.0" encoding="utf-8"?>
-<w:document xmlns:wpc="http://schemas.microsoft.com/office/word/2010/wordprocessingCanvas" xmlns:cx="http://schemas.microsoft.com/office/drawing/2014/chartex" xmlns:cx1="http://schemas.microsoft.com/office/drawing/2015/9/8/chartex" xmlns:cx2="http://schemas.microsoft.com/office/drawing/2015/10/21/chartex" xmlns:cx3="http://schemas.microsoft.com/office/drawing/2016/5/9/chartex" xmlns:cx4="http://schemas.microsoft.com/office/drawing/2016/5/10/chartex" xmlns:cx5="http://schemas.microsoft.com/office/drawing/2016/5/11/chartex" xmlns:cx6="http://schemas.microsoft.com/office/drawing/2016/5/12/chartex" xmlns:cx7="http://schemas.microsoft.com/office/drawing/2016/5/13/chartex" xmlns:cx8="http://schemas.microsoft.com/office/drawing/2016/5/14/chartex" xmlns:mc="http://schemas.openxmlformats.org/markup-compatibility/2006" xmlns:aink="http://schemas.microsoft.com/office/drawing/2016/ink" xmlns:am3d="http://schemas.microsoft.com/office/drawing/2017/model3d" xmlns:o="urn:schemas-microsoft-com:office:office" xmlns:oel="http://schemas.microsoft.com/office/2019/extlst" xmlns:r="http://schemas.openxmlformats.org/officeDocument/2006/relationships" xmlns:m="http://schemas.openxmlformats.org/officeDocument/2006/math" xmlns:v="urn:schemas-microsoft-com:vml" xmlns:wp14="http://schemas.microsoft.com/office/word/2010/wordprocessingDrawing" xmlns:wp="http://schemas.openxmlformats.org/drawingml/2006/wordprocessingDrawing" xmlns:w10="urn:schemas-microsoft-com:office:word" xmlns:w="http://schemas.openxmlformats.org/wordprocessingml/2006/main" xmlns:w14="http://schemas.microsoft.com/office/word/2010/wordml" xmlns:w15="http://schemas.microsoft.com/office/word/2012/wordml" xmlns:w16cei="http://schemas.microsoft.com/office/word/2026/wordml/cei" xmlns:w16cex="http://schemas.microsoft.com/office/word/2018/wordml/cex" xmlns:w16cid="http://schemas.microsoft.com/office/word/2016/wordml/cid" xmlns:w16="http://schemas.microsoft.com/office/word/2018/wordml" xmlns:w16du="http://schemas.microsoft.com/office/word/2023/wordml/word16du" xmlns:w16sdtdh="http://schemas.microsoft.com/office/word/2020/wordml/sdtdatahash" xmlns:w16sdtfl="http://schemas.microsoft.com/office/word/2024/wordml/sdtformatlock" xmlns:w16se="http://schemas.microsoft.com/office/word/2015/wordml/symex" xmlns:wpg="http://schemas.microsoft.com/office/word/2010/wordprocessingGroup" xmlns:wpi="http://schemas.microsoft.com/office/word/2010/wordprocessingInk" xmlns:wne="http://schemas.microsoft.com/office/word/2006/wordml" xmlns:wps="http://schemas.microsoft.com/office/word/2010/wordprocessingShape" mc:Ignorable="w14 w15 w16se w16cid w16 w16cex w16sdtdh w16sdtfl w16du wp14">
+<w:document xmlns:wpc="http://schemas.microsoft.com/office/word/2010/wordprocessingCanvas" xmlns:cx="http://schemas.microsoft.com/office/drawing/2014/chartex" xmlns:cx1="http://schemas.microsoft.com/office/drawing/2015/9/8/chartex" xmlns:cx2="http://schemas.microsoft.com/office/drawing/2015/10/21/chartex" xmlns:cx3="http://schemas.microsoft.com/office/drawing/2016/5/9/chartex" xmlns:cx4="http://schemas.microsoft.com/office/drawing/2016/5/10/chartex" xmlns:cx5="http://schemas.microsoft.com/office/drawing/2016/5/11/chartex" xmlns:cx6="http://schemas.microsoft.com/office/drawing/2016/5/12/chartex" xmlns:cx7="http://schemas.microsoft.com/office/drawing/2016/5/13/chartex" xmlns:cx8="http://schemas.microsoft.com/office/drawing/2016/5/14/chartex" xmlns:mc="http://schemas.openxmlformats.org/markup-compatibility/2006" xmlns:m="http://schemas.openxmlformats.org/officeDocument/2006/math" xmlns:aink="http://schemas.microsoft.com/office/drawing/2016/ink" xmlns:am3d="http://schemas.microsoft.com/office/drawing/2017/model3d" xmlns:oel="http://schemas.microsoft.com/office/2019/extlst" xmlns:r="http://schemas.openxmlformats.org/officeDocument/2006/relationships" xmlns:wp14="http://schemas.microsoft.com/office/word/2010/wordprocessingDrawing" xmlns:wp="http://schemas.openxmlformats.org/drawingml/2006/wordprocessingDrawing" xmlns:wpg="http://schemas.microsoft.com/office/word/2010/wordprocessingGroup" xmlns:wpi="http://schemas.microsoft.com/office/word/2010/wordprocessingInk" xmlns:wps="http://schemas.microsoft.com/office/word/2010/wordprocessingShape" xmlns:o="urn:schemas-microsoft-com:office:office" xmlns:v="urn:schemas-microsoft-com:vml" xmlns:w10="urn:schemas-microsoft-com:office:word" xmlns:w="http://schemas.openxmlformats.org/wordprocessingml/2006/main" xmlns:w14="http://schemas.microsoft.com/office/word/2010/wordml" xmlns:w15="http://schemas.microsoft.com/office/word/2012/wordml" xmlns:w16cex="http://schemas.microsoft.com/office/word/2018/wordml/cex" xmlns:w16cid="http://schemas.microsoft.com/office/word/2016/wordml/cid" xmlns:w16="http://schemas.microsoft.com/office/word/2018/wordml" xmlns:w16sdtdh="http://schemas.microsoft.com/office/word/2020/wordml/sdtdatahash" xmlns:w16sdtfl="http://schemas.microsoft.com/office/word/2024/wordml/sdtformatlock" xmlns:w16se="http://schemas.microsoft.com/office/word/2015/wordml/symex" xmlns:w16du="http://schemas.microsoft.com/office/word/2023/wordml/word16du" xmlns:wne="http://schemas.microsoft.com/office/word/2006/wordml" mc:Ignorable="w14 w15 w16se w16cid w16 w16cex w16sdtdh w16sdtfl w16du wp14">
   <w:body>
     <w:p>
       <w:pPr>
-        <w:rPr>
-          <w:rFonts w:ascii="Times New Roman" w:hAnsi="Times New Roman" w:cs="Times New Roman"/>
-        </w:rPr>
-      </w:pPr>
-      <w:r>
-        <w:rPr>
-          <w:rFonts w:ascii="Times New Roman" w:hAnsi="Times New Roman" w:cs="Times New Roman"/>
+        <w:jc w:val="center"/>
+        <w:rPr>
+          <w:rFonts w:ascii="Times New Roman" w:hAnsi="Times New Roman" w:cs="Times New Roman"/>
+          <w:b/>
+          <w:bCs/>
+        </w:rPr>
+      </w:pPr>
+      <w:r>
+        <w:rPr>
+          <w:rFonts w:ascii="Times New Roman" w:hAnsi="Times New Roman" w:cs="Times New Roman"/>
+          <w:b/>
+          <w:bCs/>
+        </w:rPr>
+        <w:t>Transformer MIDI</w:t>
+      </w:r>
+    </w:p>
+    <w:p>
+      <w:pPr>
+        <w:jc w:val="center"/>
+        <w:rPr>
+          <w:rFonts w:ascii="Times New Roman" w:hAnsi="Times New Roman" w:cs="Times New Roman"/>
+          <w:b/>
+          <w:bCs/>
+        </w:rPr>
+      </w:pPr>
+      <w:r>
+        <w:rPr>
+          <w:rFonts w:ascii="Times New Roman" w:hAnsi="Times New Roman" w:cs="Times New Roman"/>
+          <w:b/>
+          <w:bCs/>
+        </w:rPr>
+        <w:t>Rockford Lines</w:t>
+      </w:r>
+    </w:p>
+    <w:p>
+      <w:pPr>
+        <w:rPr>
+          <w:rFonts w:ascii="Times New Roman" w:hAnsi="Times New Roman" w:cs="Times New Roman"/>
+          <w:b/>
+          <w:bCs/>
+        </w:rPr>
+      </w:pPr>
+      <w:r>
+        <w:rPr>
+          <w:rFonts w:ascii="Times New Roman" w:hAnsi="Times New Roman" w:cs="Times New Roman"/>
+          <w:b/>
+          <w:bCs/>
         </w:rPr>
         <w:t>Abstract</w:t>
       </w:r>
@@ -85,11 +125,15 @@
       <w:pPr>
         <w:rPr>
           <w:rFonts w:ascii="Times New Roman" w:hAnsi="Times New Roman" w:cs="Times New Roman"/>
-        </w:rPr>
-      </w:pPr>
-      <w:r>
-        <w:rPr>
-          <w:rFonts w:ascii="Times New Roman" w:hAnsi="Times New Roman" w:cs="Times New Roman"/>
+          <w:b/>
+          <w:bCs/>
+        </w:rPr>
+      </w:pPr>
+      <w:r>
+        <w:rPr>
+          <w:rFonts w:ascii="Times New Roman" w:hAnsi="Times New Roman" w:cs="Times New Roman"/>
+          <w:b/>
+          <w:bCs/>
         </w:rPr>
         <w:t>Introduction</w:t>
       </w:r>
@@ -173,11 +217,15 @@
       <w:pPr>
         <w:rPr>
           <w:rFonts w:ascii="Times New Roman" w:hAnsi="Times New Roman" w:cs="Times New Roman"/>
-        </w:rPr>
-      </w:pPr>
-      <w:r>
-        <w:rPr>
-          <w:rFonts w:ascii="Times New Roman" w:hAnsi="Times New Roman" w:cs="Times New Roman"/>
+          <w:b/>
+          <w:bCs/>
+        </w:rPr>
+      </w:pPr>
+      <w:r>
+        <w:rPr>
+          <w:rFonts w:ascii="Times New Roman" w:hAnsi="Times New Roman" w:cs="Times New Roman"/>
+          <w:b/>
+          <w:bCs/>
         </w:rPr>
         <w:t>Research Question and Hypothesis</w:t>
       </w:r>
@@ -233,7 +281,21 @@
           <w:rFonts w:ascii="Times New Roman" w:hAnsi="Times New Roman" w:cs="Times New Roman"/>
           <w:color w:val="000000" w:themeColor="text1"/>
         </w:rPr>
-        <w:t xml:space="preserve">The MIDI files will be loaded and processed in a Jupyter notebook. MIDI is useful because it stores notes and timing instead of </w:t>
+        <w:t xml:space="preserve">The MIDI files </w:t>
+      </w:r>
+      <w:r>
+        <w:rPr>
+          <w:rFonts w:ascii="Times New Roman" w:hAnsi="Times New Roman" w:cs="Times New Roman"/>
+          <w:color w:val="000000" w:themeColor="text1"/>
+        </w:rPr>
+        <w:t xml:space="preserve">are </w:t>
+      </w:r>
+      <w:r>
+        <w:rPr>
+          <w:rFonts w:ascii="Times New Roman" w:hAnsi="Times New Roman" w:cs="Times New Roman"/>
+          <w:color w:val="000000" w:themeColor="text1"/>
+        </w:rPr>
+        <w:t xml:space="preserve">loaded and processed. MIDI is useful because it stores notes and timing instead of </w:t>
       </w:r>
       <w:r>
         <w:rPr>
@@ -254,282 +316,631 @@
           <w:rFonts w:ascii="Times New Roman" w:hAnsi="Times New Roman" w:cs="Times New Roman"/>
           <w:color w:val="000000" w:themeColor="text1"/>
         </w:rPr>
-        <w:t xml:space="preserve"> A piano has </w:t>
+        <w:t xml:space="preserve"> A piano has 88-keys, and at most each song will only have 88 distinct MIDI audio notes.</w:t>
+      </w:r>
+    </w:p>
+    <w:p>
+      <w:pPr>
+        <w:rPr>
+          <w:rFonts w:ascii="Times New Roman" w:hAnsi="Times New Roman" w:cs="Times New Roman"/>
+          <w:color w:val="000000" w:themeColor="text1"/>
+        </w:rPr>
+      </w:pPr>
+      <w:r>
+        <w:rPr>
+          <w:rFonts w:ascii="Times New Roman" w:hAnsi="Times New Roman" w:cs="Times New Roman"/>
+          <w:color w:val="000000" w:themeColor="text1"/>
+        </w:rPr>
+        <w:t xml:space="preserve">The notes will be converted into sequences that can be used by the transformer. The model will contain all the basics of a transformer: embedding layer, positional encoding, multi-head attention, and an output layer. It will be trained to predict the next </w:t>
+      </w:r>
+      <w:r>
+        <w:rPr>
+          <w:rFonts w:ascii="Times New Roman" w:hAnsi="Times New Roman" w:cs="Times New Roman"/>
+          <w:color w:val="000000" w:themeColor="text1"/>
+        </w:rPr>
+        <w:t>token</w:t>
+      </w:r>
+      <w:r>
+        <w:rPr>
+          <w:rFonts w:ascii="Times New Roman" w:hAnsi="Times New Roman" w:cs="Times New Roman"/>
+          <w:color w:val="000000" w:themeColor="text1"/>
+        </w:rPr>
+        <w:t xml:space="preserve"> in the sequence</w:t>
+      </w:r>
+      <w:r>
+        <w:rPr>
+          <w:rFonts w:ascii="Times New Roman" w:hAnsi="Times New Roman" w:cs="Times New Roman"/>
+          <w:color w:val="000000" w:themeColor="text1"/>
+        </w:rPr>
+        <w:t>.</w:t>
+      </w:r>
+    </w:p>
+    <w:p>
+      <w:pPr>
+        <w:rPr>
+          <w:rFonts w:ascii="Times New Roman" w:hAnsi="Times New Roman" w:cs="Times New Roman"/>
+        </w:rPr>
+      </w:pPr>
+      <w:r>
+        <w:rPr>
+          <w:rFonts w:ascii="Times New Roman" w:hAnsi="Times New Roman" w:cs="Times New Roman"/>
+        </w:rPr>
+        <w:t>Each note was represented using four token types:</w:t>
+      </w:r>
+    </w:p>
+    <w:p>
+      <w:pPr>
+        <w:rPr>
+          <w:rFonts w:ascii="Times New Roman" w:hAnsi="Times New Roman" w:cs="Times New Roman"/>
+        </w:rPr>
+      </w:pPr>
+      <w:r>
+        <w:rPr>
+          <w:rFonts w:ascii="Times New Roman" w:hAnsi="Times New Roman" w:cs="Times New Roman"/>
+        </w:rPr>
+        <w:t>TIME_&lt;shift&gt; PITCH_&lt;pitch&gt; DURATION_&lt;duration&gt; VELOCITY_&lt;bucket&gt;</w:t>
+      </w:r>
+    </w:p>
+    <w:p>
+      <w:pPr>
+        <w:rPr>
+          <w:rFonts w:ascii="Times New Roman" w:hAnsi="Times New Roman" w:cs="Times New Roman"/>
+        </w:rPr>
+      </w:pPr>
+      <w:r>
+        <w:rPr>
+          <w:rFonts w:ascii="Times New Roman" w:hAnsi="Times New Roman" w:cs="Times New Roman"/>
+        </w:rPr>
+        <w:t xml:space="preserve">The dataset contains 32 classical MIDI </w:t>
+      </w:r>
+      <w:r>
+        <w:rPr>
+          <w:rFonts w:ascii="Times New Roman" w:hAnsi="Times New Roman" w:cs="Times New Roman"/>
+        </w:rPr>
+        <w:t>songs. These are</w:t>
+      </w:r>
+      <w:r>
+        <w:rPr>
+          <w:rFonts w:ascii="Times New Roman" w:hAnsi="Times New Roman" w:cs="Times New Roman"/>
+        </w:rPr>
+        <w:t xml:space="preserve"> split into 24 training, four validation, and four test </w:t>
+      </w:r>
+      <w:r>
+        <w:rPr>
+          <w:rFonts w:ascii="Times New Roman" w:hAnsi="Times New Roman" w:cs="Times New Roman"/>
+        </w:rPr>
+        <w:t>songs</w:t>
+      </w:r>
+      <w:r>
+        <w:rPr>
+          <w:rFonts w:ascii="Times New Roman" w:hAnsi="Times New Roman" w:cs="Times New Roman"/>
+        </w:rPr>
+        <w:t>.</w:t>
+      </w:r>
+    </w:p>
+    <w:p>
+      <w:pPr>
+        <w:rPr>
+          <w:rFonts w:ascii="Times New Roman" w:hAnsi="Times New Roman" w:cs="Times New Roman"/>
+        </w:rPr>
+      </w:pPr>
+      <w:r>
+        <w:rPr>
+          <w:rFonts w:ascii="Times New Roman" w:hAnsi="Times New Roman" w:cs="Times New Roman"/>
+        </w:rPr>
+        <w:t>A three-layer, four-head decoder-only transformer was trained using next-token prediction.</w:t>
+      </w:r>
+    </w:p>
+    <w:p>
+      <w:pPr>
+        <w:rPr>
+          <w:rFonts w:ascii="Times New Roman" w:hAnsi="Times New Roman" w:cs="Times New Roman"/>
+        </w:rPr>
+      </w:pPr>
+    </w:p>
+    <w:p>
+      <w:pPr>
+        <w:keepNext/>
+      </w:pPr>
+      <w:r>
+        <w:rPr>
+          <w:rFonts w:ascii="Times New Roman" w:hAnsi="Times New Roman" w:cs="Times New Roman"/>
+          <w:noProof/>
+        </w:rPr>
+        <w:drawing>
+          <wp:inline distT="0" distB="0" distL="0" distR="0" wp14:anchorId="4EDF3A7A" wp14:editId="641C2E3E">
+            <wp:extent cx="5943600" cy="1391920"/>
+            <wp:effectExtent l="0" t="0" r="0" b="5080"/>
+            <wp:docPr id="1437417021" name="Picture 1"/>
+            <wp:cNvGraphicFramePr>
+              <a:graphicFrameLocks xmlns:a="http://schemas.openxmlformats.org/drawingml/2006/main" noChangeAspect="1"/>
+            </wp:cNvGraphicFramePr>
+            <a:graphic xmlns:a="http://schemas.openxmlformats.org/drawingml/2006/main">
+              <a:graphicData uri="http://schemas.openxmlformats.org/drawingml/2006/picture">
+                <pic:pic xmlns:pic="http://schemas.openxmlformats.org/drawingml/2006/picture">
+                  <pic:nvPicPr>
+                    <pic:cNvPr id="1437417021" name="Picture 1437417021"/>
+                    <pic:cNvPicPr/>
+                  </pic:nvPicPr>
+                  <pic:blipFill>
+                    <a:blip r:embed="rId7" cstate="print">
+                      <a:extLst>
+                        <a:ext uri="{28A0092B-C50C-407E-A947-70E740481C1C}">
+                          <a14:useLocalDpi xmlns:a14="http://schemas.microsoft.com/office/drawing/2010/main" val="0"/>
+                        </a:ext>
+                      </a:extLst>
+                    </a:blip>
+                    <a:stretch>
+                      <a:fillRect/>
+                    </a:stretch>
+                  </pic:blipFill>
+                  <pic:spPr>
+                    <a:xfrm>
+                      <a:off x="0" y="0"/>
+                      <a:ext cx="5943600" cy="1391920"/>
+                    </a:xfrm>
+                    <a:prstGeom prst="rect">
+                      <a:avLst/>
+                    </a:prstGeom>
+                  </pic:spPr>
+                </pic:pic>
+              </a:graphicData>
+            </a:graphic>
+          </wp:inline>
+        </w:drawing>
+      </w:r>
+    </w:p>
+    <w:p>
+      <w:pPr>
+        <w:pStyle w:val="Caption"/>
+        <w:rPr>
+          <w:rFonts w:ascii="Times New Roman" w:hAnsi="Times New Roman" w:cs="Times New Roman"/>
+        </w:rPr>
+      </w:pPr>
+      <w:r>
+        <w:t xml:space="preserve">Figure </w:t>
+      </w:r>
+      <w:fldSimple w:instr=" SEQ Figure \* ARABIC ">
+        <w:r>
+          <w:rPr>
+            <w:noProof/>
+          </w:rPr>
+          <w:t>1</w:t>
+        </w:r>
+      </w:fldSimple>
+      <w:r>
+        <w:t>: Model Pipeline (above) Transformer Architecture</w:t>
+      </w:r>
+      <w:r>
+        <w:rPr>
+          <w:noProof/>
+        </w:rPr>
+        <w:t xml:space="preserve"> (below)</w:t>
+      </w:r>
+    </w:p>
+    <w:p>
+      <w:pPr>
+        <w:rPr>
+          <w:rFonts w:ascii="Times New Roman" w:hAnsi="Times New Roman" w:cs="Times New Roman"/>
+        </w:rPr>
+      </w:pPr>
+      <w:r>
+        <w:rPr>
+          <w:rFonts w:ascii="Times New Roman" w:hAnsi="Times New Roman" w:cs="Times New Roman"/>
+        </w:rPr>
+        <w:t>Results</w:t>
+      </w:r>
+    </w:p>
+    <w:p>
+      <w:pPr>
+        <w:rPr>
+          <w:rFonts w:ascii="Times New Roman" w:hAnsi="Times New Roman" w:cs="Times New Roman"/>
+        </w:rPr>
+      </w:pPr>
+      <w:r>
+        <w:rPr>
+          <w:rFonts w:ascii="Times New Roman" w:hAnsi="Times New Roman" w:cs="Times New Roman"/>
+        </w:rPr>
+        <w:t>The transformer achieved a test perplexity of 3.31, compared with 6.10 for the bigram baseline.</w:t>
+      </w:r>
+    </w:p>
+    <w:p>
+      <w:pPr>
+        <w:rPr>
+          <w:rFonts w:ascii="Times New Roman" w:hAnsi="Times New Roman" w:cs="Times New Roman"/>
+        </w:rPr>
+      </w:pPr>
+      <w:r>
+        <w:rPr>
+          <w:rFonts w:ascii="Times New Roman" w:hAnsi="Times New Roman" w:cs="Times New Roman"/>
+        </w:rPr>
+        <w:t>Generated samples reproduced some pitch and duration characteristics of the real music. However, some samples had lower pitch diversity and temporal collapse. Seeds 45 and 49 produced more coherent results.</w:t>
+      </w:r>
+    </w:p>
+    <w:p>
+      <w:pPr>
+        <w:rPr>
+          <w:rFonts w:ascii="Times New Roman" w:hAnsi="Times New Roman" w:cs="Times New Roman"/>
+        </w:rPr>
+      </w:pPr>
+    </w:p>
+    <w:p>
+      <w:pPr>
+        <w:keepNext/>
+      </w:pPr>
+      <w:r>
+        <w:rPr>
+          <w:rFonts w:ascii="Times New Roman" w:hAnsi="Times New Roman" w:cs="Times New Roman"/>
+        </w:rPr>
+        <w:drawing>
+          <wp:inline distT="0" distB="0" distL="0" distR="0" wp14:anchorId="1D49071D" wp14:editId="4FD2E5D2">
+            <wp:extent cx="5943600" cy="3241675"/>
+            <wp:effectExtent l="0" t="0" r="0" b="0"/>
+            <wp:docPr id="983914549" name="Picture 1"/>
+            <wp:cNvGraphicFramePr>
+              <a:graphicFrameLocks xmlns:a="http://schemas.openxmlformats.org/drawingml/2006/main" noChangeAspect="1"/>
+            </wp:cNvGraphicFramePr>
+            <a:graphic xmlns:a="http://schemas.openxmlformats.org/drawingml/2006/main">
+              <a:graphicData uri="http://schemas.openxmlformats.org/drawingml/2006/picture">
+                <pic:pic xmlns:pic="http://schemas.openxmlformats.org/drawingml/2006/picture">
+                  <pic:nvPicPr>
+                    <pic:cNvPr id="983914549" name=""/>
+                    <pic:cNvPicPr/>
+                  </pic:nvPicPr>
+                  <pic:blipFill>
+                    <a:blip r:embed="rId8"/>
+                    <a:stretch>
+                      <a:fillRect/>
+                    </a:stretch>
+                  </pic:blipFill>
+                  <pic:spPr>
+                    <a:xfrm>
+                      <a:off x="0" y="0"/>
+                      <a:ext cx="5943600" cy="3241675"/>
+                    </a:xfrm>
+                    <a:prstGeom prst="rect">
+                      <a:avLst/>
+                    </a:prstGeom>
+                  </pic:spPr>
+                </pic:pic>
+              </a:graphicData>
+            </a:graphic>
+          </wp:inline>
+        </w:drawing>
+      </w:r>
+    </w:p>
+    <w:p>
+      <w:pPr>
+        <w:pStyle w:val="Caption"/>
+      </w:pPr>
+      <w:r>
+        <w:t xml:space="preserve">Figure </w:t>
+      </w:r>
+      <w:fldSimple w:instr=" SEQ Figure \* ARABIC ">
+        <w:r>
+          <w:rPr>
+            <w:noProof/>
+          </w:rPr>
+          <w:t>2</w:t>
+        </w:r>
+      </w:fldSimple>
+      <w:r>
+        <w:t>: Difference in note times between generated and training data</w:t>
+      </w:r>
+    </w:p>
+    <w:p>
+      <w:r>
+        <w:t xml:space="preserve">Figure 2 shows the difference between a random test MIDI file and a generated MIDI file. The test file clearly contains much more variation in notes, pitch, and time. These were chosen hyperparameters. It is good that the generated MIDI song has notes in a reasonable range for a song. While hard to illustrate in a research paper, the generated MIDI songs </w:t>
+      </w:r>
+    </w:p>
+    <w:p>
+      <w:pPr>
+        <w:keepNext/>
+      </w:pPr>
+      <w:r>
+        <w:rPr>
+          <w:rFonts w:ascii="Times New Roman" w:hAnsi="Times New Roman" w:cs="Times New Roman"/>
+        </w:rPr>
+        <w:lastRenderedPageBreak/>
+        <w:drawing>
+          <wp:inline distT="0" distB="0" distL="0" distR="0" wp14:anchorId="4CD8A101" wp14:editId="415565BE">
+            <wp:extent cx="5943600" cy="2641600"/>
+            <wp:effectExtent l="0" t="0" r="0" b="0"/>
+            <wp:docPr id="1474922208" name="Picture 1"/>
+            <wp:cNvGraphicFramePr>
+              <a:graphicFrameLocks xmlns:a="http://schemas.openxmlformats.org/drawingml/2006/main" noChangeAspect="1"/>
+            </wp:cNvGraphicFramePr>
+            <a:graphic xmlns:a="http://schemas.openxmlformats.org/drawingml/2006/main">
+              <a:graphicData uri="http://schemas.openxmlformats.org/drawingml/2006/picture">
+                <pic:pic xmlns:pic="http://schemas.openxmlformats.org/drawingml/2006/picture">
+                  <pic:nvPicPr>
+                    <pic:cNvPr id="1474922208" name=""/>
+                    <pic:cNvPicPr/>
+                  </pic:nvPicPr>
+                  <pic:blipFill>
+                    <a:blip r:embed="rId9"/>
+                    <a:stretch>
+                      <a:fillRect/>
+                    </a:stretch>
+                  </pic:blipFill>
+                  <pic:spPr>
+                    <a:xfrm>
+                      <a:off x="0" y="0"/>
+                      <a:ext cx="5943600" cy="2641600"/>
+                    </a:xfrm>
+                    <a:prstGeom prst="rect">
+                      <a:avLst/>
+                    </a:prstGeom>
+                  </pic:spPr>
+                </pic:pic>
+              </a:graphicData>
+            </a:graphic>
+          </wp:inline>
+        </w:drawing>
+      </w:r>
+    </w:p>
+    <w:p>
+      <w:pPr>
+        <w:pStyle w:val="Caption"/>
+      </w:pPr>
+      <w:r>
+        <w:t xml:space="preserve">Figure </w:t>
+      </w:r>
+      <w:fldSimple w:instr=" SEQ Figure \* ARABIC ">
+        <w:r>
+          <w:rPr>
+            <w:noProof/>
+          </w:rPr>
+          <w:t>3</w:t>
+        </w:r>
+      </w:fldSimple>
+      <w:r>
+        <w:t>: Pitch Distribution</w:t>
+      </w:r>
+    </w:p>
+    <w:p>
+      <w:r>
+        <w:t>Figure 3 shows that the generated sample MIDI file has a similar pitch distribution to the test MIDI file. Although just one example, it can be extrapolated that the test generated data is similar to the test data.</w:t>
+      </w:r>
+    </w:p>
+    <w:p>
+      <w:pPr>
+        <w:keepNext/>
+      </w:pPr>
+      <w:r>
+        <w:rPr>
+          <w:rFonts w:ascii="Times New Roman" w:hAnsi="Times New Roman" w:cs="Times New Roman"/>
+        </w:rPr>
+        <w:drawing>
+          <wp:inline distT="0" distB="0" distL="0" distR="0" wp14:anchorId="258B7A2E" wp14:editId="2321ABBD">
+            <wp:extent cx="5943600" cy="3714750"/>
+            <wp:effectExtent l="0" t="0" r="0" b="6350"/>
+            <wp:docPr id="489364713" name="Picture 1"/>
+            <wp:cNvGraphicFramePr>
+              <a:graphicFrameLocks xmlns:a="http://schemas.openxmlformats.org/drawingml/2006/main" noChangeAspect="1"/>
+            </wp:cNvGraphicFramePr>
+            <a:graphic xmlns:a="http://schemas.openxmlformats.org/drawingml/2006/main">
+              <a:graphicData uri="http://schemas.openxmlformats.org/drawingml/2006/picture">
+                <pic:pic xmlns:pic="http://schemas.openxmlformats.org/drawingml/2006/picture">
+                  <pic:nvPicPr>
+                    <pic:cNvPr id="489364713" name=""/>
+                    <pic:cNvPicPr/>
+                  </pic:nvPicPr>
+                  <pic:blipFill>
+                    <a:blip r:embed="rId10"/>
+                    <a:stretch>
+                      <a:fillRect/>
+                    </a:stretch>
+                  </pic:blipFill>
+                  <pic:spPr>
+                    <a:xfrm>
+                      <a:off x="0" y="0"/>
+                      <a:ext cx="5943600" cy="3714750"/>
+                    </a:xfrm>
+                    <a:prstGeom prst="rect">
+                      <a:avLst/>
+                    </a:prstGeom>
+                  </pic:spPr>
+                </pic:pic>
+              </a:graphicData>
+            </a:graphic>
+          </wp:inline>
+        </w:drawing>
+      </w:r>
+    </w:p>
+    <w:p>
+      <w:pPr>
+        <w:pStyle w:val="Caption"/>
+      </w:pPr>
+      <w:r>
+        <w:t xml:space="preserve">Figure </w:t>
+      </w:r>
+      <w:fldSimple w:instr=" SEQ Figure \* ARABIC ">
+        <w:r>
+          <w:rPr>
+            <w:noProof/>
+          </w:rPr>
+          <w:t>4</w:t>
+        </w:r>
+      </w:fldSimple>
+      <w:r>
+        <w:t>: Training and Validation Loss</w:t>
+      </w:r>
+    </w:p>
+    <w:p>
+      <w:r>
+        <w:lastRenderedPageBreak/>
+        <w:t>In Figure 4, we see that after 50 epochs, the validation loss declined and was mostly static while the training loss continued to decline until about 100 epochs.</w:t>
+      </w:r>
+    </w:p>
+    <w:p>
+      <w:pPr>
+        <w:rPr>
+          <w:rFonts w:ascii="Times New Roman" w:hAnsi="Times New Roman" w:cs="Times New Roman"/>
+        </w:rPr>
+      </w:pPr>
+      <w:r>
+        <w:rPr>
+          <w:rFonts w:ascii="Times New Roman" w:hAnsi="Times New Roman" w:cs="Times New Roman"/>
+        </w:rPr>
+        <w:t>Discussion</w:t>
+      </w:r>
+    </w:p>
+    <w:p>
+      <w:pPr>
+        <w:rPr>
+          <w:rFonts w:ascii="Times New Roman" w:hAnsi="Times New Roman" w:cs="Times New Roman"/>
+        </w:rPr>
+      </w:pPr>
+      <w:r>
+        <w:rPr>
+          <w:rFonts w:ascii="Times New Roman" w:hAnsi="Times New Roman" w:cs="Times New Roman"/>
+        </w:rPr>
+        <w:t>The results suggest that the transformer learned useful patterns beyond simple bigram relationships. However, good perplexity did not always translate into coherent generated music.</w:t>
+      </w:r>
+    </w:p>
+    <w:p>
+      <w:pPr>
+        <w:rPr>
+          <w:rFonts w:ascii="Times New Roman" w:hAnsi="Times New Roman" w:cs="Times New Roman"/>
+        </w:rPr>
+      </w:pPr>
+      <w:r>
+        <w:rPr>
+          <w:rFonts w:ascii="Times New Roman" w:hAnsi="Times New Roman" w:cs="Times New Roman"/>
+        </w:rPr>
+        <w:t xml:space="preserve">Temporal collapse is an issue that is common due to lack of training data or model robustness. </w:t>
+      </w:r>
+      <w:r>
+        <w:rPr>
+          <w:rFonts w:ascii="Times New Roman" w:hAnsi="Times New Roman" w:cs="Times New Roman"/>
+        </w:rPr>
+        <w:t>There are only 32 songs in the dataset, so the Transformer is more likely to learn little patterns as opposed to song creation in general.</w:t>
+      </w:r>
+    </w:p>
+    <w:p>
+      <w:pPr>
+        <w:rPr>
+          <w:rFonts w:ascii="Times New Roman" w:hAnsi="Times New Roman" w:cs="Times New Roman"/>
+        </w:rPr>
+      </w:pPr>
+      <w:r>
+        <w:rPr>
+          <w:rFonts w:ascii="Times New Roman" w:hAnsi="Times New Roman" w:cs="Times New Roman"/>
+        </w:rPr>
+        <w:t xml:space="preserve">Future improvements to this transformer architecture could be incorporating more MIDI songs in the data. 32 songs </w:t>
       </w:r>
       <w:proofErr w:type="gramStart"/>
       <w:r>
         <w:rPr>
           <w:rFonts w:ascii="Times New Roman" w:hAnsi="Times New Roman" w:cs="Times New Roman"/>
-          <w:color w:val="000000" w:themeColor="text1"/>
-        </w:rPr>
-        <w:t>88-keys</w:t>
+        </w:rPr>
+        <w:t>is</w:t>
       </w:r>
       <w:proofErr w:type="gramEnd"/>
       <w:r>
         <w:rPr>
           <w:rFonts w:ascii="Times New Roman" w:hAnsi="Times New Roman" w:cs="Times New Roman"/>
-          <w:color w:val="000000" w:themeColor="text1"/>
-        </w:rPr>
-        <w:t>, and at most each song will only have 88 distinct MIDI audio notes.</w:t>
-      </w:r>
-    </w:p>
-    <w:p>
-      <w:pPr>
-        <w:rPr>
-          <w:rFonts w:ascii="Times New Roman" w:hAnsi="Times New Roman" w:cs="Times New Roman"/>
-        </w:rPr>
-      </w:pPr>
-      <w:r>
-        <w:rPr>
-          <w:rFonts w:ascii="Times New Roman" w:hAnsi="Times New Roman" w:cs="Times New Roman"/>
-          <w:color w:val="000000" w:themeColor="text1"/>
-        </w:rPr>
-        <w:t>The notes will be converted into sequences that can be used by the transformer. The model will contain all the basics of a transformer: embedding layer, positional encoding, multi-head attention, and an output layer. It will be trained to predict the next note in the sequence</w:t>
-      </w:r>
-      <w:r>
-        <w:rPr>
-          <w:rFonts w:ascii="Times New Roman" w:hAnsi="Times New Roman" w:cs="Times New Roman"/>
-          <w:color w:val="000000" w:themeColor="text1"/>
-        </w:rPr>
-        <w:t>.</w:t>
-      </w:r>
-    </w:p>
-    <w:p>
-      <w:pPr>
-        <w:rPr>
-          <w:rFonts w:ascii="Times New Roman" w:hAnsi="Times New Roman" w:cs="Times New Roman"/>
-        </w:rPr>
-      </w:pPr>
-      <w:r>
-        <w:rPr>
-          <w:rFonts w:ascii="Times New Roman" w:hAnsi="Times New Roman" w:cs="Times New Roman"/>
-        </w:rPr>
-        <w:t xml:space="preserve">The dataset contains 32 classical MIDI </w:t>
-      </w:r>
-      <w:r>
-        <w:rPr>
-          <w:rFonts w:ascii="Times New Roman" w:hAnsi="Times New Roman" w:cs="Times New Roman"/>
-        </w:rPr>
-        <w:t>songs. These are</w:t>
-      </w:r>
-      <w:r>
-        <w:rPr>
-          <w:rFonts w:ascii="Times New Roman" w:hAnsi="Times New Roman" w:cs="Times New Roman"/>
-        </w:rPr>
-        <w:t xml:space="preserve"> split into 24 training, four </w:t>
+        </w:rPr>
+        <w:t xml:space="preserve"> not very robust. </w:t>
+      </w:r>
+      <w:r>
+        <w:rPr>
+          <w:rFonts w:ascii="Times New Roman" w:hAnsi="Times New Roman" w:cs="Times New Roman"/>
+        </w:rPr>
+        <w:t xml:space="preserve">With 88 notes on a piano and possibilities of many notes being played at a time, there are possibly an endless variation of songs. The low amount of training data increases the risk for overfitting. </w:t>
+      </w:r>
+    </w:p>
+    <w:p>
+      <w:pPr>
+        <w:rPr>
+          <w:rFonts w:ascii="Times New Roman" w:hAnsi="Times New Roman" w:cs="Times New Roman"/>
+        </w:rPr>
+      </w:pPr>
+      <w:r>
+        <w:rPr>
+          <w:rFonts w:ascii="Times New Roman" w:hAnsi="Times New Roman" w:cs="Times New Roman"/>
+        </w:rPr>
+        <w:t xml:space="preserve">The model doesn’t understand notes or </w:t>
       </w:r>
       <w:proofErr w:type="gramStart"/>
       <w:r>
         <w:rPr>
           <w:rFonts w:ascii="Times New Roman" w:hAnsi="Times New Roman" w:cs="Times New Roman"/>
         </w:rPr>
-        <w:t>validation</w:t>
+        <w:t>time,</w:t>
       </w:r>
       <w:proofErr w:type="gramEnd"/>
       <w:r>
         <w:rPr>
           <w:rFonts w:ascii="Times New Roman" w:hAnsi="Times New Roman" w:cs="Times New Roman"/>
         </w:rPr>
-        <w:t xml:space="preserve">, and four test </w:t>
-      </w:r>
-      <w:r>
-        <w:rPr>
-          <w:rFonts w:ascii="Times New Roman" w:hAnsi="Times New Roman" w:cs="Times New Roman"/>
-        </w:rPr>
-        <w:t>songs</w:t>
-      </w:r>
-      <w:r>
-        <w:rPr>
-          <w:rFonts w:ascii="Times New Roman" w:hAnsi="Times New Roman" w:cs="Times New Roman"/>
-        </w:rPr>
-        <w:t>.</w:t>
-      </w:r>
-    </w:p>
-    <w:p>
-      <w:pPr>
-        <w:rPr>
-          <w:rFonts w:ascii="Times New Roman" w:hAnsi="Times New Roman" w:cs="Times New Roman"/>
-        </w:rPr>
-      </w:pPr>
-      <w:r>
-        <w:rPr>
-          <w:rFonts w:ascii="Times New Roman" w:hAnsi="Times New Roman" w:cs="Times New Roman"/>
-        </w:rPr>
-        <w:t>Each note was represented using four token types:</w:t>
-      </w:r>
-    </w:p>
-    <w:p>
-      <w:pPr>
-        <w:rPr>
-          <w:rFonts w:ascii="Times New Roman" w:hAnsi="Times New Roman" w:cs="Times New Roman"/>
-        </w:rPr>
-      </w:pPr>
-      <w:r>
-        <w:rPr>
-          <w:rFonts w:ascii="Times New Roman" w:hAnsi="Times New Roman" w:cs="Times New Roman"/>
-        </w:rPr>
-        <w:t>TIME_&lt;shift&gt; PITCH_&lt;pitch&gt; DURATION_&lt;duration&gt; VELOCITY_&lt;bucket&gt;</w:t>
-      </w:r>
-    </w:p>
-    <w:p>
-      <w:pPr>
-        <w:rPr>
-          <w:rFonts w:ascii="Times New Roman" w:hAnsi="Times New Roman" w:cs="Times New Roman"/>
-        </w:rPr>
-      </w:pPr>
-      <w:r>
-        <w:rPr>
-          <w:rFonts w:ascii="Times New Roman" w:hAnsi="Times New Roman" w:cs="Times New Roman"/>
-        </w:rPr>
-        <w:t>A three-layer, four-head decoder-only transformer was trained using next-token prediction.</w:t>
-      </w:r>
-    </w:p>
-    <w:p>
-      <w:pPr>
-        <w:rPr>
-          <w:rFonts w:ascii="Times New Roman" w:hAnsi="Times New Roman" w:cs="Times New Roman"/>
-        </w:rPr>
-      </w:pPr>
-      <w:r>
-        <w:rPr>
-          <w:rFonts w:ascii="Times New Roman" w:hAnsi="Times New Roman" w:cs="Times New Roman"/>
-        </w:rPr>
-        <w:t>Results</w:t>
-      </w:r>
-    </w:p>
-    <w:p>
-      <w:pPr>
-        <w:rPr>
-          <w:rFonts w:ascii="Times New Roman" w:hAnsi="Times New Roman" w:cs="Times New Roman"/>
-        </w:rPr>
-      </w:pPr>
-      <w:r>
-        <w:rPr>
-          <w:rFonts w:ascii="Times New Roman" w:hAnsi="Times New Roman" w:cs="Times New Roman"/>
-        </w:rPr>
-        <w:t>The transformer achieved a test perplexity of 3.31, compared with 6.10 for the bigram baseline.</w:t>
-      </w:r>
-    </w:p>
-    <w:p>
-      <w:pPr>
-        <w:rPr>
-          <w:rFonts w:ascii="Times New Roman" w:hAnsi="Times New Roman" w:cs="Times New Roman"/>
-        </w:rPr>
-      </w:pPr>
-      <w:r>
-        <w:rPr>
-          <w:rFonts w:ascii="Times New Roman" w:hAnsi="Times New Roman" w:cs="Times New Roman"/>
-        </w:rPr>
-        <w:lastRenderedPageBreak/>
-        <w:t>Generated samples reproduced some pitch and duration characteristics of the real music. However, some samples had lower pitch diversity and temporal collapse. Seeds 45 and 49 produced more coherent results.</w:t>
-      </w:r>
-    </w:p>
-    <w:p>
-      <w:pPr>
-        <w:rPr>
-          <w:rFonts w:ascii="Times New Roman" w:hAnsi="Times New Roman" w:cs="Times New Roman"/>
-        </w:rPr>
-      </w:pPr>
-      <w:r>
-        <w:rPr>
-          <w:rFonts w:ascii="Times New Roman" w:hAnsi="Times New Roman" w:cs="Times New Roman"/>
-        </w:rPr>
-        <w:t>Discussion</w:t>
-      </w:r>
-    </w:p>
-    <w:p>
-      <w:pPr>
-        <w:rPr>
-          <w:rFonts w:ascii="Times New Roman" w:hAnsi="Times New Roman" w:cs="Times New Roman"/>
-        </w:rPr>
-      </w:pPr>
-      <w:r>
-        <w:rPr>
-          <w:rFonts w:ascii="Times New Roman" w:hAnsi="Times New Roman" w:cs="Times New Roman"/>
-        </w:rPr>
-        <w:t>The results suggest that the transformer learned useful patterns beyond simple bigram relationships. However, good perplexity did not always translate into coherent generated music.</w:t>
-      </w:r>
-    </w:p>
-    <w:p>
-      <w:pPr>
-        <w:rPr>
-          <w:rFonts w:ascii="Times New Roman" w:hAnsi="Times New Roman" w:cs="Times New Roman"/>
-        </w:rPr>
-      </w:pPr>
-      <w:r>
-        <w:rPr>
-          <w:rFonts w:ascii="Times New Roman" w:hAnsi="Times New Roman" w:cs="Times New Roman"/>
-        </w:rPr>
-        <w:t xml:space="preserve">Temporal collapse is an issue that is common due to lack of training data or model robustness. </w:t>
-      </w:r>
-    </w:p>
-    <w:p>
-      <w:pPr>
-        <w:rPr>
-          <w:rFonts w:ascii="Times New Roman" w:hAnsi="Times New Roman" w:cs="Times New Roman"/>
-        </w:rPr>
-      </w:pPr>
-      <w:r>
-        <w:rPr>
-          <w:rFonts w:ascii="Times New Roman" w:hAnsi="Times New Roman" w:cs="Times New Roman"/>
-        </w:rPr>
-        <w:t xml:space="preserve">Future improvements to this transformer architecture could be incorporating more MIDI songs in the data. 32 songs </w:t>
-      </w:r>
-      <w:proofErr w:type="gramStart"/>
-      <w:r>
-        <w:rPr>
-          <w:rFonts w:ascii="Times New Roman" w:hAnsi="Times New Roman" w:cs="Times New Roman"/>
-        </w:rPr>
-        <w:t>is</w:t>
-      </w:r>
-      <w:proofErr w:type="gramEnd"/>
-      <w:r>
-        <w:rPr>
-          <w:rFonts w:ascii="Times New Roman" w:hAnsi="Times New Roman" w:cs="Times New Roman"/>
-        </w:rPr>
-        <w:t xml:space="preserve"> not very robust. Tokenization has different hyperparameters that could be tweaked as well.</w:t>
-      </w:r>
-    </w:p>
-    <w:p>
-      <w:pPr>
-        <w:rPr>
-          <w:rFonts w:ascii="Times New Roman" w:hAnsi="Times New Roman" w:cs="Times New Roman"/>
-        </w:rPr>
-      </w:pPr>
-      <w:r>
-        <w:rPr>
-          <w:rFonts w:ascii="Times New Roman" w:hAnsi="Times New Roman" w:cs="Times New Roman"/>
-        </w:rPr>
-        <w:t>[Discuss why temporal collapse may have occurred.]</w:t>
-      </w:r>
-    </w:p>
-    <w:p>
-      <w:pPr>
-        <w:rPr>
-          <w:rFonts w:ascii="Times New Roman" w:hAnsi="Times New Roman" w:cs="Times New Roman"/>
-        </w:rPr>
-      </w:pPr>
-      <w:r>
-        <w:rPr>
-          <w:rFonts w:ascii="Times New Roman" w:hAnsi="Times New Roman" w:cs="Times New Roman"/>
-        </w:rPr>
-        <w:t>[Discuss limitations of dataset size, tokenization, and context length.]</w:t>
-      </w:r>
-    </w:p>
-    <w:p>
-      <w:pPr>
-        <w:rPr>
-          <w:rFonts w:ascii="Times New Roman" w:hAnsi="Times New Roman" w:cs="Times New Roman"/>
-        </w:rPr>
-      </w:pPr>
-      <w:r>
-        <w:rPr>
-          <w:rFonts w:ascii="Times New Roman" w:hAnsi="Times New Roman" w:cs="Times New Roman"/>
-        </w:rPr>
-        <w:t>[Discuss what could be improved in future experiments.]</w:t>
-      </w:r>
-    </w:p>
-    <w:p/>
+        <w:t xml:space="preserve"> it just gets fed in tokens. Therefore, the many choices of how to construct the model are going to greatly change the training of the model. Time-shift, duration, and velocity bins are examples of hyperparameters that greatly change the performance of the model. The training data has notes being played at various time steps, whereas the tokens are standardized for the model to learn more easily. </w:t>
+      </w:r>
+    </w:p>
+    <w:p>
+      <w:pPr>
+        <w:rPr>
+          <w:rFonts w:ascii="Times New Roman" w:hAnsi="Times New Roman" w:cs="Times New Roman"/>
+        </w:rPr>
+      </w:pPr>
+      <w:r>
+        <w:rPr>
+          <w:rFonts w:ascii="Times New Roman" w:hAnsi="Times New Roman" w:cs="Times New Roman"/>
+        </w:rPr>
+        <w:t xml:space="preserve">The context length of the model is 256 tokens. This model has limitations on learning long term dependencies since anything longer than 256 tokens won’t be learned. </w:t>
+      </w:r>
+    </w:p>
+    <w:p>
+      <w:r>
+        <w:rPr>
+          <w:rFonts w:ascii="Times New Roman" w:hAnsi="Times New Roman" w:cs="Times New Roman"/>
+        </w:rPr>
+        <w:t xml:space="preserve">The obvious future research for this project will involve more training data. Additional future directions of MIDI transformer research are </w:t>
+      </w:r>
+      <w:proofErr w:type="spellStart"/>
+      <w:r>
+        <w:rPr>
+          <w:rFonts w:ascii="Times New Roman" w:hAnsi="Times New Roman" w:cs="Times New Roman"/>
+        </w:rPr>
+        <w:t>experimention</w:t>
+      </w:r>
+      <w:proofErr w:type="spellEnd"/>
+      <w:r>
+        <w:rPr>
+          <w:rFonts w:ascii="Times New Roman" w:hAnsi="Times New Roman" w:cs="Times New Roman"/>
+        </w:rPr>
+        <w:t xml:space="preserve"> with tokenization </w:t>
+      </w:r>
+      <w:proofErr w:type="spellStart"/>
+      <w:r>
+        <w:rPr>
+          <w:rFonts w:ascii="Times New Roman" w:hAnsi="Times New Roman" w:cs="Times New Roman"/>
+        </w:rPr>
+        <w:t>hyperparamters</w:t>
+      </w:r>
+      <w:proofErr w:type="spellEnd"/>
+      <w:r>
+        <w:rPr>
+          <w:rFonts w:ascii="Times New Roman" w:hAnsi="Times New Roman" w:cs="Times New Roman"/>
+        </w:rPr>
+        <w:t xml:space="preserve">, longer context length, and other training </w:t>
+      </w:r>
+      <w:proofErr w:type="spellStart"/>
+      <w:r>
+        <w:rPr>
+          <w:rFonts w:ascii="Times New Roman" w:hAnsi="Times New Roman" w:cs="Times New Roman"/>
+        </w:rPr>
+        <w:t>hyperparamters</w:t>
+      </w:r>
+      <w:proofErr w:type="spellEnd"/>
+      <w:r>
+        <w:rPr>
+          <w:rFonts w:ascii="Times New Roman" w:hAnsi="Times New Roman" w:cs="Times New Roman"/>
+        </w:rPr>
+        <w:t xml:space="preserve">. These will better research and better results. </w:t>
+      </w:r>
+    </w:p>
     <w:sectPr>
       <w:pgSz w:w="12240" w:h="15840"/>
       <w:pgMar w:top="1440" w:right="1440" w:bottom="1440" w:left="1440" w:header="720" w:footer="720" w:gutter="0"/>
@@ -540,8 +951,58 @@
 </w:document>
 </file>
 
+<file path=word/endnotes.xml><?xml version="1.0" encoding="utf-8"?>
+<w:endnotes xmlns:wpc="http://schemas.microsoft.com/office/word/2010/wordprocessingCanvas" xmlns:cx="http://schemas.microsoft.com/office/drawing/2014/chartex" xmlns:cx1="http://schemas.microsoft.com/office/drawing/2015/9/8/chartex" xmlns:cx2="http://schemas.microsoft.com/office/drawing/2015/10/21/chartex" xmlns:cx3="http://schemas.microsoft.com/office/drawing/2016/5/9/chartex" xmlns:cx4="http://schemas.microsoft.com/office/drawing/2016/5/10/chartex" xmlns:cx5="http://schemas.microsoft.com/office/drawing/2016/5/11/chartex" xmlns:cx6="http://schemas.microsoft.com/office/drawing/2016/5/12/chartex" xmlns:cx7="http://schemas.microsoft.com/office/drawing/2016/5/13/chartex" xmlns:cx8="http://schemas.microsoft.com/office/drawing/2016/5/14/chartex" xmlns:mc="http://schemas.openxmlformats.org/markup-compatibility/2006" xmlns:m="http://schemas.openxmlformats.org/officeDocument/2006/math" xmlns:aink="http://schemas.microsoft.com/office/drawing/2016/ink" xmlns:am3d="http://schemas.microsoft.com/office/drawing/2017/model3d" xmlns:oel="http://schemas.microsoft.com/office/2019/extlst" xmlns:r="http://schemas.openxmlformats.org/officeDocument/2006/relationships" xmlns:wp14="http://schemas.microsoft.com/office/word/2010/wordprocessingDrawing" xmlns:wp="http://schemas.openxmlformats.org/drawingml/2006/wordprocessingDrawing" xmlns:wpg="http://schemas.microsoft.com/office/word/2010/wordprocessingGroup" xmlns:wpi="http://schemas.microsoft.com/office/word/2010/wordprocessingInk" xmlns:wps="http://schemas.microsoft.com/office/word/2010/wordprocessingShape" xmlns:o="urn:schemas-microsoft-com:office:office" xmlns:v="urn:schemas-microsoft-com:vml" xmlns:w10="urn:schemas-microsoft-com:office:word" xmlns:w="http://schemas.openxmlformats.org/wordprocessingml/2006/main" xmlns:w14="http://schemas.microsoft.com/office/word/2010/wordml" xmlns:w15="http://schemas.microsoft.com/office/word/2012/wordml" xmlns:w16cex="http://schemas.microsoft.com/office/word/2018/wordml/cex" xmlns:w16cid="http://schemas.microsoft.com/office/word/2016/wordml/cid" xmlns:w16="http://schemas.microsoft.com/office/word/2018/wordml" xmlns:w16sdtdh="http://schemas.microsoft.com/office/word/2020/wordml/sdtdatahash" xmlns:w16sdtfl="http://schemas.microsoft.com/office/word/2024/wordml/sdtformatlock" xmlns:w16se="http://schemas.microsoft.com/office/word/2015/wordml/symex" xmlns:w16du="http://schemas.microsoft.com/office/word/2023/wordml/word16du" xmlns:wne="http://schemas.microsoft.com/office/word/2006/wordml" mc:Ignorable="w14 w15 w16se w16cid w16 w16cex w16sdtdh w16sdtfl w16du wp14">
+  <w:endnote w:type="separator" w:id="-1">
+    <w:p>
+      <w:pPr>
+        <w:spacing w:after="0" w:line="240" w:lineRule="auto"/>
+      </w:pPr>
+      <w:r>
+        <w:separator/>
+      </w:r>
+    </w:p>
+  </w:endnote>
+  <w:endnote w:type="continuationSeparator" w:id="0">
+    <w:p>
+      <w:pPr>
+        <w:spacing w:after="0" w:line="240" w:lineRule="auto"/>
+      </w:pPr>
+      <w:r>
+        <w:continuationSeparator/>
+      </w:r>
+    </w:p>
+  </w:endnote>
+</w:endnotes>
+</file>
+
+<file path=word/footnotes.xml><?xml version="1.0" encoding="utf-8"?>
+<w:footnotes xmlns:wpc="http://schemas.microsoft.com/office/word/2010/wordprocessingCanvas" xmlns:cx="http://schemas.microsoft.com/office/drawing/2014/chartex" xmlns:cx1="http://schemas.microsoft.com/office/drawing/2015/9/8/chartex" xmlns:cx2="http://schemas.microsoft.com/office/drawing/2015/10/21/chartex" xmlns:cx3="http://schemas.microsoft.com/office/drawing/2016/5/9/chartex" xmlns:cx4="http://schemas.microsoft.com/office/drawing/2016/5/10/chartex" xmlns:cx5="http://schemas.microsoft.com/office/drawing/2016/5/11/chartex" xmlns:cx6="http://schemas.microsoft.com/office/drawing/2016/5/12/chartex" xmlns:cx7="http://schemas.microsoft.com/office/drawing/2016/5/13/chartex" xmlns:cx8="http://schemas.microsoft.com/office/drawing/2016/5/14/chartex" xmlns:mc="http://schemas.openxmlformats.org/markup-compatibility/2006" xmlns:m="http://schemas.openxmlformats.org/officeDocument/2006/math" xmlns:aink="http://schemas.microsoft.com/office/drawing/2016/ink" xmlns:am3d="http://schemas.microsoft.com/office/drawing/2017/model3d" xmlns:oel="http://schemas.microsoft.com/office/2019/extlst" xmlns:r="http://schemas.openxmlformats.org/officeDocument/2006/relationships" xmlns:wp14="http://schemas.microsoft.com/office/word/2010/wordprocessingDrawing" xmlns:wp="http://schemas.openxmlformats.org/drawingml/2006/wordprocessingDrawing" xmlns:wpg="http://schemas.microsoft.com/office/word/2010/wordprocessingGroup" xmlns:wpi="http://schemas.microsoft.com/office/word/2010/wordprocessingInk" xmlns:wps="http://schemas.microsoft.com/office/word/2010/wordprocessingShape" xmlns:o="urn:schemas-microsoft-com:office:office" xmlns:v="urn:schemas-microsoft-com:vml" xmlns:w10="urn:schemas-microsoft-com:office:word" xmlns:w="http://schemas.openxmlformats.org/wordprocessingml/2006/main" xmlns:w14="http://schemas.microsoft.com/office/word/2010/wordml" xmlns:w15="http://schemas.microsoft.com/office/word/2012/wordml" xmlns:w16cex="http://schemas.microsoft.com/office/word/2018/wordml/cex" xmlns:w16cid="http://schemas.microsoft.com/office/word/2016/wordml/cid" xmlns:w16="http://schemas.microsoft.com/office/word/2018/wordml" xmlns:w16sdtdh="http://schemas.microsoft.com/office/word/2020/wordml/sdtdatahash" xmlns:w16sdtfl="http://schemas.microsoft.com/office/word/2024/wordml/sdtformatlock" xmlns:w16se="http://schemas.microsoft.com/office/word/2015/wordml/symex" xmlns:w16du="http://schemas.microsoft.com/office/word/2023/wordml/word16du" xmlns:wne="http://schemas.microsoft.com/office/word/2006/wordml" mc:Ignorable="w14 w15 w16se w16cid w16 w16cex w16sdtdh w16sdtfl w16du wp14">
+  <w:footnote w:type="separator" w:id="-1">
+    <w:p>
+      <w:pPr>
+        <w:spacing w:after="0" w:line="240" w:lineRule="auto"/>
+      </w:pPr>
+      <w:r>
+        <w:separator/>
+      </w:r>
+    </w:p>
+  </w:footnote>
+  <w:footnote w:type="continuationSeparator" w:id="0">
+    <w:p>
+      <w:pPr>
+        <w:spacing w:after="0" w:line="240" w:lineRule="auto"/>
+      </w:pPr>
+      <w:r>
+        <w:continuationSeparator/>
+      </w:r>
+    </w:p>
+  </w:footnote>
+</w:footnotes>
+</file>
+
 <file path=word/styles.xml><?xml version="1.0" encoding="utf-8"?>
-<w:styles xmlns:mc="http://schemas.openxmlformats.org/markup-compatibility/2006" xmlns:r="http://schemas.openxmlformats.org/officeDocument/2006/relationships" xmlns:w="http://schemas.openxmlformats.org/wordprocessingml/2006/main" xmlns:w14="http://schemas.microsoft.com/office/word/2010/wordml" xmlns:w15="http://schemas.microsoft.com/office/word/2012/wordml" xmlns:w16cex="http://schemas.microsoft.com/office/word/2018/wordml/cex" xmlns:w16cid="http://schemas.microsoft.com/office/word/2016/wordml/cid" xmlns:w16="http://schemas.microsoft.com/office/word/2018/wordml" xmlns:w16du="http://schemas.microsoft.com/office/word/2023/wordml/word16du" xmlns:w16sdtdh="http://schemas.microsoft.com/office/word/2020/wordml/sdtdatahash" xmlns:w16sdtfl="http://schemas.microsoft.com/office/word/2024/wordml/sdtformatlock" xmlns:w16se="http://schemas.microsoft.com/office/word/2015/wordml/symex" mc:Ignorable="w14 w15 w16se w16cid w16 w16cex w16sdtdh w16sdtfl w16du">
+<w:styles xmlns:mc="http://schemas.openxmlformats.org/markup-compatibility/2006" xmlns:r="http://schemas.openxmlformats.org/officeDocument/2006/relationships" xmlns:w="http://schemas.openxmlformats.org/wordprocessingml/2006/main" xmlns:w14="http://schemas.microsoft.com/office/word/2010/wordml" xmlns:w15="http://schemas.microsoft.com/office/word/2012/wordml" xmlns:w16cex="http://schemas.microsoft.com/office/word/2018/wordml/cex" xmlns:w16cid="http://schemas.microsoft.com/office/word/2016/wordml/cid" xmlns:w16="http://schemas.microsoft.com/office/word/2018/wordml" xmlns:w16sdtdh="http://schemas.microsoft.com/office/word/2020/wordml/sdtdatahash" xmlns:w16sdtfl="http://schemas.microsoft.com/office/word/2024/wordml/sdtformatlock" xmlns:w16se="http://schemas.microsoft.com/office/word/2015/wordml/symex" xmlns:w16du="http://schemas.microsoft.com/office/word/2023/wordml/word16du" mc:Ignorable="w14 w15 w16se w16cid w16 w16cex w16sdtdh w16sdtfl w16du">
   <w:docDefaults>
     <w:rPrDefault>
       <w:rPr>
@@ -1456,6 +1917,69 @@
       <w:spacing w:val="5"/>
     </w:rPr>
   </w:style>
+  <w:style w:type="paragraph" w:styleId="Caption">
+    <w:name w:val="caption"/>
+    <w:basedOn w:val="Normal"/>
+    <w:next w:val="Normal"/>
+    <w:uiPriority w:val="35"/>
+    <w:unhideWhenUsed/>
+    <w:qFormat/>
+    <w:rsid w:val="00AF67FB"/>
+    <w:pPr>
+      <w:spacing w:after="200" w:line="240" w:lineRule="auto"/>
+    </w:pPr>
+    <w:rPr>
+      <w:i/>
+      <w:iCs/>
+      <w:color w:val="0E2841" w:themeColor="text2"/>
+      <w:sz w:val="18"/>
+      <w:szCs w:val="18"/>
+    </w:rPr>
+  </w:style>
+  <w:style w:type="paragraph" w:styleId="Header">
+    <w:name w:val="header"/>
+    <w:basedOn w:val="Normal"/>
+    <w:link w:val="HeaderChar"/>
+    <w:uiPriority w:val="99"/>
+    <w:unhideWhenUsed/>
+    <w:rsid w:val="00645DC5"/>
+    <w:pPr>
+      <w:tabs>
+        <w:tab w:val="center" w:pos="4680"/>
+        <w:tab w:val="right" w:pos="9360"/>
+      </w:tabs>
+      <w:spacing w:after="0" w:line="240" w:lineRule="auto"/>
+    </w:pPr>
+  </w:style>
+  <w:style w:type="character" w:customStyle="1" w:styleId="HeaderChar">
+    <w:name w:val="Header Char"/>
+    <w:basedOn w:val="DefaultParagraphFont"/>
+    <w:link w:val="Header"/>
+    <w:uiPriority w:val="99"/>
+    <w:rsid w:val="00645DC5"/>
+  </w:style>
+  <w:style w:type="paragraph" w:styleId="Footer">
+    <w:name w:val="footer"/>
+    <w:basedOn w:val="Normal"/>
+    <w:link w:val="FooterChar"/>
+    <w:uiPriority w:val="99"/>
+    <w:unhideWhenUsed/>
+    <w:rsid w:val="00645DC5"/>
+    <w:pPr>
+      <w:tabs>
+        <w:tab w:val="center" w:pos="4680"/>
+        <w:tab w:val="right" w:pos="9360"/>
+      </w:tabs>
+      <w:spacing w:after="0" w:line="240" w:lineRule="auto"/>
+    </w:pPr>
+  </w:style>
+  <w:style w:type="character" w:customStyle="1" w:styleId="FooterChar">
+    <w:name w:val="Footer Char"/>
+    <w:basedOn w:val="DefaultParagraphFont"/>
+    <w:link w:val="Footer"/>
+    <w:uiPriority w:val="99"/>
+    <w:rsid w:val="00645DC5"/>
+  </w:style>
 </w:styles>
 </file>
 
@@ -1772,4 +2296,16 @@
     </a:ext>
   </a:extLst>
 </a:theme>
+</file>
+
+<file path=customXml/item1.xml><?xml version="1.0" encoding="utf-8"?>
+<b:Sources xmlns:b="http://schemas.openxmlformats.org/officeDocument/2006/bibliography" xmlns="http://schemas.openxmlformats.org/officeDocument/2006/bibliography" SelectedStyle="/APASixthEditionOfficeOnline.xsl" StyleName="APA" Version="6"/>
+</file>
+
+<file path=customXml/itemProps1.xml><?xml version="1.0" encoding="utf-8"?>
+<ds:datastoreItem xmlns:ds="http://schemas.openxmlformats.org/officeDocument/2006/customXml" ds:itemID="{86FDFCE8-A4A5-3744-88CD-19EC98BA545D}">
+  <ds:schemaRefs>
+    <ds:schemaRef ds:uri="http://schemas.openxmlformats.org/officeDocument/2006/bibliography"/>
+  </ds:schemaRefs>
+</ds:datastoreItem>
 </file>
</xml_diff>